<commit_message>
docs: tambah section 5.11 GitHub repository di laporan
- Sub-section baru menjelaskan URL repo, isi, cara clone, dan manfaat
  publikasi open-source
- Update Kesimpulan untuk mention GitHub repository
- Tambah pattern ~$* di .gitignore (Word/LibreOffice lock files)
</commit_message>
<xml_diff>
--- a/reports/Laporan_Proyek_Data_Mining.docx
+++ b/reports/Laporan_Proyek_Data_Mining.docx
@@ -4618,6 +4618,328 @@
     </w:p>
     <w:p>
       <w:pPr>
+        <w:pStyle w:val="Heading2"/>
+      </w:pPr>
+      <w:r>
+        <w:rPr>
+          <w:color w:val="1F3A5F"/>
+        </w:rPr>
+        <w:t>5.11 Source Code Repository (GitHub)</w:t>
+      </w:r>
+    </w:p>
+    <w:p>
+      <w:pPr>
+        <w:spacing w:after="120"/>
+        <w:ind w:firstLine="425"/>
+        <w:jc w:val="both"/>
+      </w:pPr>
+      <w:r>
+        <w:rPr>
+          <w:sz w:val="22"/>
+        </w:rPr>
+        <w:t>Seluruh source code, model, konfigurasi pipeline, laporan, dan dokumentasi proyek di-publish sebagai repositori open-source di GitHub untuk transparansi, reproducibility, dan kemudahan akses bagi reviewer:</w:t>
+      </w:r>
+    </w:p>
+    <w:p>
+      <w:pPr>
+        <w:jc w:val="center"/>
+      </w:pPr>
+      <w:r>
+        <w:rPr>
+          <w:b/>
+          <w:color w:val="1F3A5F"/>
+          <w:sz w:val="24"/>
+        </w:rPr>
+        <w:t>https://github.com/rafafifuwae/rfm-customer-segmentation</w:t>
+      </w:r>
+    </w:p>
+    <w:p>
+      <w:pPr>
+        <w:spacing w:after="120"/>
+      </w:pPr>
+      <w:r>
+        <w:rPr>
+          <w:b/>
+          <w:i w:val="0"/>
+          <w:sz w:val="22"/>
+        </w:rPr>
+        <w:t>Isi Repository:</w:t>
+      </w:r>
+    </w:p>
+    <w:p>
+      <w:pPr>
+        <w:pStyle w:val="ListBullet"/>
+        <w:spacing w:after="40"/>
+      </w:pPr>
+      <w:r>
+        <w:rPr>
+          <w:sz w:val="22"/>
+        </w:rPr>
+        <w:t>Pipeline notebook lengkap (data collection, EDA, preprocessing, modeling) dengan output cell tersimpan untuk dibaca langsung di GitHub.</w:t>
+      </w:r>
+    </w:p>
+    <w:p>
+      <w:pPr>
+        <w:pStyle w:val="ListBullet"/>
+        <w:spacing w:after="40"/>
+      </w:pPr>
+      <w:r>
+        <w:rPr>
+          <w:sz w:val="22"/>
+        </w:rPr>
+        <w:t>Source code aplikasi serving (FastAPI + Streamlit + predictor wrapper) yang siap di-clone dan dijalankan.</w:t>
+      </w:r>
+    </w:p>
+    <w:p>
+      <w:pPr>
+        <w:pStyle w:val="ListBullet"/>
+        <w:spacing w:after="40"/>
+      </w:pPr>
+      <w:r>
+        <w:rPr>
+          <w:sz w:val="22"/>
+        </w:rPr>
+        <w:t>Model K-Means terlatih (models/kmeans_rfm.pkl, 374 KB) beserta serving artifacts (winsorize bounds + segment mapping).</w:t>
+      </w:r>
+    </w:p>
+    <w:p>
+      <w:pPr>
+        <w:pStyle w:val="ListBullet"/>
+        <w:spacing w:after="40"/>
+      </w:pPr>
+      <w:r>
+        <w:rPr>
+          <w:sz w:val="22"/>
+        </w:rPr>
+        <w:t>Docker config (Dockerfile, start.sh) untuk deployment otomatis ke Hugging Face Spaces atau platform container lain.</w:t>
+      </w:r>
+    </w:p>
+    <w:p>
+      <w:pPr>
+        <w:pStyle w:val="ListBullet"/>
+        <w:spacing w:after="40"/>
+      </w:pPr>
+      <w:r>
+        <w:rPr>
+          <w:sz w:val="22"/>
+        </w:rPr>
+        <w:t>27 file gambar visualisasi (21 figure modeling + 6 screenshot deployment) sebagai bukti hasil dan dokumentasi visual.</w:t>
+      </w:r>
+    </w:p>
+    <w:p>
+      <w:pPr>
+        <w:pStyle w:val="ListBullet"/>
+        <w:spacing w:after="40"/>
+      </w:pPr>
+      <w:r>
+        <w:rPr>
+          <w:sz w:val="22"/>
+        </w:rPr>
+        <w:t>Laporan tugas dalam format DOCX yang siap di-review.</w:t>
+      </w:r>
+    </w:p>
+    <w:p>
+      <w:pPr>
+        <w:pStyle w:val="ListBullet"/>
+        <w:spacing w:after="40"/>
+      </w:pPr>
+      <w:r>
+        <w:rPr>
+          <w:sz w:val="22"/>
+        </w:rPr>
+        <w:t>DVC pipeline configuration (dvc.yaml, params.yaml) untuk reproducibility eksperimen.</w:t>
+      </w:r>
+    </w:p>
+    <w:p>
+      <w:pPr>
+        <w:spacing w:after="120"/>
+      </w:pPr>
+      <w:r>
+        <w:rPr>
+          <w:b/>
+          <w:i w:val="0"/>
+          <w:sz w:val="22"/>
+        </w:rPr>
+        <w:t>Tidak Disertakan (sesuai .gitignore):</w:t>
+      </w:r>
+    </w:p>
+    <w:p>
+      <w:pPr>
+        <w:pStyle w:val="ListBullet"/>
+        <w:spacing w:after="40"/>
+      </w:pPr>
+      <w:r>
+        <w:rPr>
+          <w:sz w:val="22"/>
+        </w:rPr>
+        <w:t>Dataset raw Olist (~120 MB) — terlalu besar untuk Git biasa. Dataset dapat di-download dari Kaggle (referensi link di README) atau di-track via DVC remote.</w:t>
+      </w:r>
+    </w:p>
+    <w:p>
+      <w:pPr>
+        <w:pStyle w:val="ListBullet"/>
+        <w:spacing w:after="40"/>
+      </w:pPr>
+      <w:r>
+        <w:rPr>
+          <w:sz w:val="22"/>
+        </w:rPr>
+        <w:t>Virtual environment (.venv) dan dependency yang terinstall — dapat di-restore via pip install -r requirements.txt.</w:t>
+      </w:r>
+    </w:p>
+    <w:p>
+      <w:pPr>
+        <w:pStyle w:val="ListBullet"/>
+        <w:spacing w:after="40"/>
+      </w:pPr>
+      <w:r>
+        <w:rPr>
+          <w:sz w:val="22"/>
+        </w:rPr>
+        <w:t>File cache dan temporary lain (__pycache__, .ipynb_checkpoints, .dvc/cache).</w:t>
+      </w:r>
+    </w:p>
+    <w:p>
+      <w:pPr>
+        <w:spacing w:after="120"/>
+      </w:pPr>
+      <w:r>
+        <w:rPr>
+          <w:b/>
+          <w:i w:val="0"/>
+          <w:sz w:val="22"/>
+        </w:rPr>
+        <w:t>Cara Clone &amp; Jalankan:</w:t>
+      </w:r>
+    </w:p>
+    <w:p>
+      <w:pPr>
+        <w:spacing w:after="120"/>
+        <w:ind w:left="283"/>
+        <w:shd w:fill="F2F2F2"/>
+      </w:pPr>
+      <w:r>
+        <w:rPr>
+          <w:rFonts w:ascii="Consolas" w:hAnsi="Consolas"/>
+          <w:sz w:val="18"/>
+          <w:rFonts w:ascii="Consolas" w:hAnsi="Consolas" w:cs="Consolas"/>
+        </w:rPr>
+        <w:t># 1. Clone repository</w:t>
+        <w:br/>
+        <w:t>git clone https://github.com/rafafifuwae/rfm-customer-segmentation.git</w:t>
+        <w:br/>
+        <w:t>cd rfm-customer-segmentation</w:t>
+        <w:br/>
+        <w:br/>
+        <w:t># 2. Setup virtual environment</w:t>
+        <w:br/>
+        <w:t>python -m venv .venv</w:t>
+        <w:br/>
+        <w:t>source .venv/bin/activate          # Linux/Mac</w:t>
+        <w:br/>
+        <w:t># .venv\Scripts\activate          # Windows</w:t>
+        <w:br/>
+        <w:br/>
+        <w:t># 3. Install dependencies</w:t>
+        <w:br/>
+        <w:t>pip install -r requirements.txt</w:t>
+        <w:br/>
+        <w:br/>
+        <w:t># 4. (Opsional) Download dataset Olist dari Kaggle</w:t>
+        <w:br/>
+        <w:t>#    https://www.kaggle.com/datasets/olistbr/brazilian-ecommerce</w:t>
+        <w:br/>
+        <w:t>#    Ekstrak ke folder data/raw/</w:t>
+        <w:br/>
+        <w:t>#    (Skip langkah ini kalau hanya ingin menjalankan inference,</w:t>
+        <w:br/>
+        <w:t>#     karena model &amp; serving artifacts sudah ter-include)</w:t>
+        <w:br/>
+        <w:br/>
+        <w:t># 5. Jalankan aplikasi</w:t>
+        <w:br/>
+        <w:t>./scripts/run_app.sh</w:t>
+        <w:br/>
+        <w:t>#    UI       : http://localhost:8501</w:t>
+        <w:br/>
+        <w:t>#    API docs : http://localhost:8000/docs</w:t>
+      </w:r>
+    </w:p>
+    <w:p>
+      <w:pPr>
+        <w:spacing w:after="120"/>
+      </w:pPr>
+      <w:r>
+        <w:rPr>
+          <w:b/>
+          <w:i w:val="0"/>
+          <w:sz w:val="22"/>
+        </w:rPr>
+        <w:t>Manfaat Publikasi di GitHub:</w:t>
+      </w:r>
+    </w:p>
+    <w:p>
+      <w:pPr>
+        <w:pStyle w:val="ListBullet"/>
+        <w:spacing w:after="40"/>
+      </w:pPr>
+      <w:r>
+        <w:rPr>
+          <w:sz w:val="22"/>
+        </w:rPr>
+        <w:t>Transparansi penelitian — reviewer/dosen dapat memeriksa setiap baris kode dan keputusan teknis langsung di browser.</w:t>
+      </w:r>
+    </w:p>
+    <w:p>
+      <w:pPr>
+        <w:pStyle w:val="ListBullet"/>
+        <w:spacing w:after="40"/>
+      </w:pPr>
+      <w:r>
+        <w:rPr>
+          <w:sz w:val="22"/>
+        </w:rPr>
+        <w:t>Reproducibility — siapa pun dapat menjalankan ulang pipeline yang sama dengan random_state yang fixed.</w:t>
+      </w:r>
+    </w:p>
+    <w:p>
+      <w:pPr>
+        <w:pStyle w:val="ListBullet"/>
+        <w:spacing w:after="40"/>
+      </w:pPr>
+      <w:r>
+        <w:rPr>
+          <w:sz w:val="22"/>
+        </w:rPr>
+        <w:t>Portofolio profesional — repository menjadi bukti karya nyata dengan dokumentasi lengkap (commit history, README, kode).</w:t>
+      </w:r>
+    </w:p>
+    <w:p>
+      <w:pPr>
+        <w:pStyle w:val="ListBullet"/>
+        <w:spacing w:after="40"/>
+      </w:pPr>
+      <w:r>
+        <w:rPr>
+          <w:sz w:val="22"/>
+        </w:rPr>
+        <w:t>Versioning — perubahan kode tercatat lengkap melalui commit history, memudahkan tracking eksperimen.</w:t>
+      </w:r>
+    </w:p>
+    <w:p>
+      <w:pPr>
+        <w:pStyle w:val="ListBullet"/>
+        <w:spacing w:after="40"/>
+      </w:pPr>
+      <w:r>
+        <w:rPr>
+          <w:sz w:val="22"/>
+        </w:rPr>
+        <w:t>Kolaborasi — siapa pun dapat fork, contribute, atau mengadaptasi project untuk dataset lain.</w:t>
+      </w:r>
+    </w:p>
+    <w:p>
+      <w:pPr>
         <w:pStyle w:val="Heading1"/>
       </w:pPr>
       <w:r>
@@ -4651,6 +4973,19 @@
           <w:sz w:val="22"/>
         </w:rPr>
         <w:t>Dari sisi deployment, sistem dirancang dengan tiga layer yang saling melengkapi: (1) Layer lokal untuk development, (2) Layer demo publik via Cloudflare Tunnel untuk presentasi cepat tanpa biaya tambahan, dan (3) Layer hosting permanen via Docker + Hugging Face Spaces untuk akses 24/7. Aplikasi dapat diakses melalui Web UI Streamlit yang interaktif maupun REST API FastAPI yang siap diintegrasikan dengan sistem lain. Strategi multi-layer ini memastikan transisi mulus dari development hingga production tanpa perubahan kode aplikasi.</w:t>
+      </w:r>
+    </w:p>
+    <w:p>
+      <w:pPr>
+        <w:spacing w:after="120"/>
+        <w:ind w:firstLine="425"/>
+        <w:jc w:val="both"/>
+      </w:pPr>
+      <w:r>
+        <w:rPr>
+          <w:sz w:val="22"/>
+        </w:rPr>
+        <w:t>Sebagai bentuk transparansi dan untuk mendukung reproducibility, seluruh kode, model, konfigurasi, dan laporan dipublikasikan sebagai repository open-source di GitHub (https://github.com/rafafifuwae/rfm-customer-segmentation) sehingga reviewer maupun pihak ketiga dapat memeriksa, menjalankan ulang, atau mengadaptasi sistem ini untuk dataset lain.</w:t>
       </w:r>
     </w:p>
     <w:sectPr>

</xml_diff>

<commit_message>
docs: ganti ASCII diagram dengan PNG (research flow, arsitektur, multi-layer)
3 diagram baru ter-generate via matplotlib di reports/figures/diagrams/:
- 01_research_flow.png — CRISP-DM 6 fase
- 02_deployment_architecture.png — FastAPI + Streamlit + Predictor pipeline
- 03_deployment_layers.png — Lokal / Tunnel / HF Spaces

Laporan section 3 (Diagram Alur), 5.1 (Arsitektur), dan 5.9 (Multi-Layer)
sekarang pakai gambar PNG resolusi tinggi (200 DPI) sebagai ganti
ASCII art di code block. Total gambar di laporan: 15 → 18.

Script scripts/generate_diagrams.py reusable untuk regenerate kalau
mau update warna / layout.
</commit_message>
<xml_diff>
--- a/reports/Laporan_Proyek_Data_Mining.docx
+++ b/reports/Laporan_Proyek_Data_Mining.docx
@@ -395,155 +395,55 @@
     </w:p>
     <w:p>
       <w:pPr>
-        <w:spacing w:after="120"/>
-        <w:ind w:left="283"/>
-        <w:shd w:fill="F2F2F2"/>
+        <w:jc w:val="center"/>
+      </w:pPr>
+      <w:r>
+        <w:drawing>
+          <wp:inline xmlns:a="http://schemas.openxmlformats.org/drawingml/2006/main" xmlns:pic="http://schemas.openxmlformats.org/drawingml/2006/picture">
+            <wp:extent cx="5040000" cy="5965195"/>
+            <wp:docPr id="1" name="Picture 1"/>
+            <wp:cNvGraphicFramePr>
+              <a:graphicFrameLocks noChangeAspect="1"/>
+            </wp:cNvGraphicFramePr>
+            <a:graphic>
+              <a:graphicData uri="http://schemas.openxmlformats.org/drawingml/2006/picture">
+                <pic:pic>
+                  <pic:nvPicPr>
+                    <pic:cNvPr id="0" name="01_research_flow.png"/>
+                    <pic:cNvPicPr/>
+                  </pic:nvPicPr>
+                  <pic:blipFill>
+                    <a:blip r:embed="rId9"/>
+                    <a:stretch>
+                      <a:fillRect/>
+                    </a:stretch>
+                  </pic:blipFill>
+                  <pic:spPr>
+                    <a:xfrm>
+                      <a:off x="0" y="0"/>
+                      <a:ext cx="5040000" cy="5965195"/>
+                    </a:xfrm>
+                    <a:prstGeom prst="rect"/>
+                  </pic:spPr>
+                </pic:pic>
+              </a:graphicData>
+            </a:graphic>
+          </wp:inline>
+        </w:drawing>
+      </w:r>
+    </w:p>
+    <w:p>
+      <w:pPr>
+        <w:spacing w:after="240"/>
+        <w:jc w:val="center"/>
       </w:pPr>
       <w:r>
         <w:rPr>
-          <w:rFonts w:ascii="Consolas" w:hAnsi="Consolas"/>
-          <w:sz w:val="18"/>
-          <w:rFonts w:ascii="Consolas" w:hAnsi="Consolas" w:cs="Consolas"/>
+          <w:i/>
+          <w:color w:val="555555"/>
+          <w:sz w:val="20"/>
         </w:rPr>
-        <w:t>┌─────────────────────────────────────────────────────────┐</w:t>
-        <w:br/>
-        <w:t>│            ALUR PENELITIAN DATA MINING                  │</w:t>
-        <w:br/>
-        <w:t>│   (Adaptasi CRISP-DM untuk Segmentasi Pelanggan)        │</w:t>
-        <w:br/>
-        <w:t>└─────────────────────────────────────────────────────────┘</w:t>
-        <w:br/>
-        <w:br/>
-        <w:t xml:space="preserve">      ┌──────────────────────────┐</w:t>
-        <w:br/>
-        <w:t xml:space="preserve">      │ 1. BUSINESS UNDERSTANDING│</w:t>
-        <w:br/>
-        <w:t xml:space="preserve">      │  - Identifikasi masalah  │</w:t>
-        <w:br/>
-        <w:t xml:space="preserve">      │  - Definisi tujuan       │</w:t>
-        <w:br/>
-        <w:t xml:space="preserve">      │  - Definisi keberhasilan │</w:t>
-        <w:br/>
-        <w:t xml:space="preserve">      └────────────┬─────────────┘</w:t>
-        <w:br/>
-        <w:t xml:space="preserve">                   │</w:t>
-        <w:br/>
-        <w:t xml:space="preserve">                   ▼</w:t>
-        <w:br/>
-        <w:t xml:space="preserve">      ┌──────────────────────────┐</w:t>
-        <w:br/>
-        <w:t xml:space="preserve">      │  2. DATA UNDERSTANDING   │  →  01_data_collection.ipynb</w:t>
-        <w:br/>
-        <w:t xml:space="preserve">      │  - Load 9 tabel Olist    │     02_eda.ipynb</w:t>
-        <w:br/>
-        <w:t xml:space="preserve">      │  - Validasi schema       │     reports/data_dictionary.csv</w:t>
-        <w:br/>
-        <w:t xml:space="preserve">      │  - EDA (uni/bi/multivar) │     reports/figures/*.png</w:t>
-        <w:br/>
-        <w:t xml:space="preserve">      │  - Cek refer. integrity  │</w:t>
-        <w:br/>
-        <w:t xml:space="preserve">      └────────────┬─────────────┘</w:t>
-        <w:br/>
-        <w:t xml:space="preserve">                   │</w:t>
-        <w:br/>
-        <w:t xml:space="preserve">                   ▼</w:t>
-        <w:br/>
-        <w:t xml:space="preserve">      ┌──────────────────────────┐</w:t>
-        <w:br/>
-        <w:t xml:space="preserve">      │   3. DATA PREPARATION    │  →  03_data_preprocessing.ipynb</w:t>
-        <w:br/>
-        <w:t xml:space="preserve">      │  a. Cleaning             │     - Filter status = delivered</w:t>
-        <w:br/>
-        <w:t xml:space="preserve">      │  b. Merging              │     - Merge orders+customers+pay</w:t>
-        <w:br/>
-        <w:t xml:space="preserve">      │  c. Aggregation          │     - Group by customer_unique_id</w:t>
-        <w:br/>
-        <w:t xml:space="preserve">      │  d. RFM Feature Eng.     │     - Recency/Frequency/Monetary</w:t>
-        <w:br/>
-        <w:t xml:space="preserve">      │  e. Outlier handling     │     - Winsorize (99th percentile)</w:t>
-        <w:br/>
-        <w:t xml:space="preserve">      │  f. Transformation       │     - Log1p (Frequency, Monetary)</w:t>
-        <w:br/>
-        <w:t xml:space="preserve">      │  g. RFM Scoring          │     - Quintile-based (1-5)</w:t>
-        <w:br/>
-        <w:t xml:space="preserve">      │  Output: rfm_table.csv   │</w:t>
-        <w:br/>
-        <w:t xml:space="preserve">      └────────────┬─────────────┘</w:t>
-        <w:br/>
-        <w:t xml:space="preserve">                   │</w:t>
-        <w:br/>
-        <w:t xml:space="preserve">                   ▼</w:t>
-        <w:br/>
-        <w:t xml:space="preserve">      ┌──────────────────────────┐</w:t>
-        <w:br/>
-        <w:t xml:space="preserve">      │      4. MODELING         │  →  04_rfm_kmeans_modeling.ipynb</w:t>
-        <w:br/>
-        <w:t xml:space="preserve">      │  - StandardScaler        │</w:t>
-        <w:br/>
-        <w:t xml:space="preserve">      │  - Pemilihan k (2..10)   │     • Elbow Method</w:t>
-        <w:br/>
-        <w:t xml:space="preserve">      │                          │     • Silhouette Score</w:t>
-        <w:br/>
-        <w:t xml:space="preserve">      │                          │     • Davies-Bouldin Index</w:t>
-        <w:br/>
-        <w:t xml:space="preserve">      │  - Fit K-Means (k=4)     │     n_init=20, random_state=42</w:t>
-        <w:br/>
-        <w:t xml:space="preserve">      │  - PCA visualisasi 2D    │</w:t>
-        <w:br/>
-        <w:t xml:space="preserve">      │  Output: kmeans_rfm.pkl  │</w:t>
-        <w:br/>
-        <w:t xml:space="preserve">      └────────────┬─────────────┘</w:t>
-        <w:br/>
-        <w:t xml:space="preserve">                   │</w:t>
-        <w:br/>
-        <w:t xml:space="preserve">                   ▼</w:t>
-        <w:br/>
-        <w:t xml:space="preserve">      ┌──────────────────────────┐</w:t>
-        <w:br/>
-        <w:t xml:space="preserve">      │     5. EVALUATION        │  →  models/kmeans_metrics.json</w:t>
-        <w:br/>
-        <w:t xml:space="preserve">      │  Metrik Internal:        │     reports/figures/</w:t>
-        <w:br/>
-        <w:t xml:space="preserve">      │  - Silhouette = 0.372    │       cluster_snake_plot.png</w:t>
-        <w:br/>
-        <w:t xml:space="preserve">      │  - Davies-Bouldin = 0.76 │       cluster_pca_scatter.png</w:t>
-        <w:br/>
-        <w:t xml:space="preserve">      │  - Inertia = 79.016      │       cluster_size.png</w:t>
-        <w:br/>
-        <w:t xml:space="preserve">      │  Interpretasi Bisnis:    │</w:t>
-        <w:br/>
-        <w:t xml:space="preserve">      │  - Champions             │</w:t>
-        <w:br/>
-        <w:t xml:space="preserve">      │  - Loyal Customers       │</w:t>
-        <w:br/>
-        <w:t xml:space="preserve">      │  - At Risk               │</w:t>
-        <w:br/>
-        <w:t xml:space="preserve">      │  - Hibernating / Lost    │</w:t>
-        <w:br/>
-        <w:t xml:space="preserve">      │  Output: rfm_segmented   │</w:t>
-        <w:br/>
-        <w:t xml:space="preserve">      └────────────┬─────────────┘</w:t>
-        <w:br/>
-        <w:t xml:space="preserve">                   │</w:t>
-        <w:br/>
-        <w:t xml:space="preserve">                   ▼</w:t>
-        <w:br/>
-        <w:t xml:space="preserve">      ┌──────────────────────────┐</w:t>
-        <w:br/>
-        <w:t xml:space="preserve">      │     6. DEPLOYMENT        │  →  app/api.py        (FastAPI)</w:t>
-        <w:br/>
-        <w:t xml:space="preserve">      │  - Build serving artifact│     app/streamlit_app.py (UI)</w:t>
-        <w:br/>
-        <w:t xml:space="preserve">      │  - REST API (FastAPI)    │     app/predictor.py</w:t>
-        <w:br/>
-        <w:t xml:space="preserve">      │  - Web UI (Streamlit)    │     models/serving_artifacts.json</w:t>
-        <w:br/>
-        <w:t xml:space="preserve">      │  - DVC pipeline          │     dvc.yaml + params.yaml</w:t>
-        <w:br/>
-        <w:t xml:space="preserve">      │    (reproducible)        │</w:t>
-        <w:br/>
-        <w:t xml:space="preserve">      └──────────────────────────┘</w:t>
-        <w:br/>
+        <w:t>Gambar 3.1 — Diagram alur penelitian data mining (adaptasi CRISP-DM untuk segmentasi pelanggan)</w:t>
       </w:r>
     </w:p>
     <w:p>
@@ -964,7 +864,7 @@
         <w:drawing>
           <wp:inline xmlns:a="http://schemas.openxmlformats.org/drawingml/2006/main" xmlns:pic="http://schemas.openxmlformats.org/drawingml/2006/picture">
             <wp:extent cx="4680000" cy="1304539"/>
-            <wp:docPr id="1" name="Picture 1"/>
+            <wp:docPr id="2" name="Picture 2"/>
             <wp:cNvGraphicFramePr>
               <a:graphicFrameLocks noChangeAspect="1"/>
             </wp:cNvGraphicFramePr>
@@ -976,7 +876,7 @@
                     <pic:cNvPicPr/>
                   </pic:nvPicPr>
                   <pic:blipFill>
-                    <a:blip r:embed="rId9"/>
+                    <a:blip r:embed="rId10"/>
                     <a:stretch>
                       <a:fillRect/>
                     </a:stretch>
@@ -1017,7 +917,7 @@
         <w:drawing>
           <wp:inline xmlns:a="http://schemas.openxmlformats.org/drawingml/2006/main" xmlns:pic="http://schemas.openxmlformats.org/drawingml/2006/picture">
             <wp:extent cx="4680000" cy="3472644"/>
-            <wp:docPr id="2" name="Picture 2"/>
+            <wp:docPr id="3" name="Picture 3"/>
             <wp:cNvGraphicFramePr>
               <a:graphicFrameLocks noChangeAspect="1"/>
             </wp:cNvGraphicFramePr>
@@ -1029,7 +929,7 @@
                     <pic:cNvPicPr/>
                   </pic:nvPicPr>
                   <pic:blipFill>
-                    <a:blip r:embed="rId10"/>
+                    <a:blip r:embed="rId11"/>
                     <a:stretch>
                       <a:fillRect/>
                     </a:stretch>
@@ -1070,7 +970,7 @@
         <w:drawing>
           <wp:inline xmlns:a="http://schemas.openxmlformats.org/drawingml/2006/main" xmlns:pic="http://schemas.openxmlformats.org/drawingml/2006/picture">
             <wp:extent cx="5040000" cy="1642167"/>
-            <wp:docPr id="3" name="Picture 3"/>
+            <wp:docPr id="4" name="Picture 4"/>
             <wp:cNvGraphicFramePr>
               <a:graphicFrameLocks noChangeAspect="1"/>
             </wp:cNvGraphicFramePr>
@@ -1082,7 +982,7 @@
                     <pic:cNvPicPr/>
                   </pic:nvPicPr>
                   <pic:blipFill>
-                    <a:blip r:embed="rId11"/>
+                    <a:blip r:embed="rId12"/>
                     <a:stretch>
                       <a:fillRect/>
                     </a:stretch>
@@ -1285,7 +1185,7 @@
         <w:drawing>
           <wp:inline xmlns:a="http://schemas.openxmlformats.org/drawingml/2006/main" xmlns:pic="http://schemas.openxmlformats.org/drawingml/2006/picture">
             <wp:extent cx="5400000" cy="1305587"/>
-            <wp:docPr id="4" name="Picture 4"/>
+            <wp:docPr id="5" name="Picture 5"/>
             <wp:cNvGraphicFramePr>
               <a:graphicFrameLocks noChangeAspect="1"/>
             </wp:cNvGraphicFramePr>
@@ -1297,7 +1197,7 @@
                     <pic:cNvPicPr/>
                   </pic:nvPicPr>
                   <pic:blipFill>
-                    <a:blip r:embed="rId12"/>
+                    <a:blip r:embed="rId13"/>
                     <a:stretch>
                       <a:fillRect/>
                     </a:stretch>
@@ -1338,7 +1238,7 @@
         <w:drawing>
           <wp:inline xmlns:a="http://schemas.openxmlformats.org/drawingml/2006/main" xmlns:pic="http://schemas.openxmlformats.org/drawingml/2006/picture">
             <wp:extent cx="5400000" cy="1315203"/>
-            <wp:docPr id="5" name="Picture 5"/>
+            <wp:docPr id="6" name="Picture 6"/>
             <wp:cNvGraphicFramePr>
               <a:graphicFrameLocks noChangeAspect="1"/>
             </wp:cNvGraphicFramePr>
@@ -1350,7 +1250,7 @@
                     <pic:cNvPicPr/>
                   </pic:nvPicPr>
                   <pic:blipFill>
-                    <a:blip r:embed="rId13"/>
+                    <a:blip r:embed="rId14"/>
                     <a:stretch>
                       <a:fillRect/>
                     </a:stretch>
@@ -1527,7 +1427,7 @@
         <w:drawing>
           <wp:inline xmlns:a="http://schemas.openxmlformats.org/drawingml/2006/main" xmlns:pic="http://schemas.openxmlformats.org/drawingml/2006/picture">
             <wp:extent cx="5400000" cy="1315203"/>
-            <wp:docPr id="6" name="Picture 6"/>
+            <wp:docPr id="7" name="Picture 7"/>
             <wp:cNvGraphicFramePr>
               <a:graphicFrameLocks noChangeAspect="1"/>
             </wp:cNvGraphicFramePr>
@@ -1539,7 +1439,7 @@
                     <pic:cNvPicPr/>
                   </pic:nvPicPr>
                   <pic:blipFill>
-                    <a:blip r:embed="rId14"/>
+                    <a:blip r:embed="rId15"/>
                     <a:stretch>
                       <a:fillRect/>
                     </a:stretch>
@@ -2508,7 +2408,7 @@
         <w:drawing>
           <wp:inline xmlns:a="http://schemas.openxmlformats.org/drawingml/2006/main" xmlns:pic="http://schemas.openxmlformats.org/drawingml/2006/picture">
             <wp:extent cx="5040000" cy="2782500"/>
-            <wp:docPr id="7" name="Picture 7"/>
+            <wp:docPr id="8" name="Picture 8"/>
             <wp:cNvGraphicFramePr>
               <a:graphicFrameLocks noChangeAspect="1"/>
             </wp:cNvGraphicFramePr>
@@ -2520,7 +2420,7 @@
                     <pic:cNvPicPr/>
                   </pic:nvPicPr>
                   <pic:blipFill>
-                    <a:blip r:embed="rId15"/>
+                    <a:blip r:embed="rId16"/>
                     <a:stretch>
                       <a:fillRect/>
                     </a:stretch>
@@ -2561,7 +2461,7 @@
         <w:drawing>
           <wp:inline xmlns:a="http://schemas.openxmlformats.org/drawingml/2006/main" xmlns:pic="http://schemas.openxmlformats.org/drawingml/2006/picture">
             <wp:extent cx="4320000" cy="3227375"/>
-            <wp:docPr id="8" name="Picture 8"/>
+            <wp:docPr id="9" name="Picture 9"/>
             <wp:cNvGraphicFramePr>
               <a:graphicFrameLocks noChangeAspect="1"/>
             </wp:cNvGraphicFramePr>
@@ -2573,7 +2473,7 @@
                     <pic:cNvPicPr/>
                   </pic:nvPicPr>
                   <pic:blipFill>
-                    <a:blip r:embed="rId16"/>
+                    <a:blip r:embed="rId17"/>
                     <a:stretch>
                       <a:fillRect/>
                     </a:stretch>
@@ -2614,7 +2514,7 @@
         <w:drawing>
           <wp:inline xmlns:a="http://schemas.openxmlformats.org/drawingml/2006/main" xmlns:pic="http://schemas.openxmlformats.org/drawingml/2006/picture">
             <wp:extent cx="4680000" cy="2682302"/>
-            <wp:docPr id="9" name="Picture 9"/>
+            <wp:docPr id="10" name="Picture 10"/>
             <wp:cNvGraphicFramePr>
               <a:graphicFrameLocks noChangeAspect="1"/>
             </wp:cNvGraphicFramePr>
@@ -2626,7 +2526,7 @@
                     <pic:cNvPicPr/>
                   </pic:nvPicPr>
                   <pic:blipFill>
-                    <a:blip r:embed="rId17"/>
+                    <a:blip r:embed="rId18"/>
                     <a:stretch>
                       <a:fillRect/>
                     </a:stretch>
@@ -2701,81 +2601,55 @@
     </w:p>
     <w:p>
       <w:pPr>
-        <w:spacing w:after="120"/>
-        <w:ind w:left="283"/>
-        <w:shd w:fill="F2F2F2"/>
+        <w:jc w:val="center"/>
+      </w:pPr>
+      <w:r>
+        <w:drawing>
+          <wp:inline xmlns:a="http://schemas.openxmlformats.org/drawingml/2006/main" xmlns:pic="http://schemas.openxmlformats.org/drawingml/2006/picture">
+            <wp:extent cx="5040000" cy="5965195"/>
+            <wp:docPr id="11" name="Picture 11"/>
+            <wp:cNvGraphicFramePr>
+              <a:graphicFrameLocks noChangeAspect="1"/>
+            </wp:cNvGraphicFramePr>
+            <a:graphic>
+              <a:graphicData uri="http://schemas.openxmlformats.org/drawingml/2006/picture">
+                <pic:pic>
+                  <pic:nvPicPr>
+                    <pic:cNvPr id="0" name="02_deployment_architecture.png"/>
+                    <pic:cNvPicPr/>
+                  </pic:nvPicPr>
+                  <pic:blipFill>
+                    <a:blip r:embed="rId19"/>
+                    <a:stretch>
+                      <a:fillRect/>
+                    </a:stretch>
+                  </pic:blipFill>
+                  <pic:spPr>
+                    <a:xfrm>
+                      <a:off x="0" y="0"/>
+                      <a:ext cx="5040000" cy="5965195"/>
+                    </a:xfrm>
+                    <a:prstGeom prst="rect"/>
+                  </pic:spPr>
+                </pic:pic>
+              </a:graphicData>
+            </a:graphic>
+          </wp:inline>
+        </w:drawing>
+      </w:r>
+    </w:p>
+    <w:p>
+      <w:pPr>
+        <w:spacing w:after="240"/>
+        <w:jc w:val="center"/>
       </w:pPr>
       <w:r>
         <w:rPr>
-          <w:rFonts w:ascii="Consolas" w:hAnsi="Consolas"/>
-          <w:sz w:val="18"/>
-          <w:rFonts w:ascii="Consolas" w:hAnsi="Consolas" w:cs="Consolas"/>
+          <w:i/>
+          <w:color w:val="555555"/>
+          <w:sz w:val="20"/>
         </w:rPr>
-        <w:t>┌─────────────────────────────────────────────────────────┐</w:t>
-        <w:br/>
-        <w:t>│              ARSITEKTUR DEPLOYMENT                       │</w:t>
-        <w:br/>
-        <w:t>└─────────────────────────────────────────────────────────┘</w:t>
-        <w:br/>
-        <w:br/>
-        <w:t xml:space="preserve">   Browser (User)</w:t>
-        <w:br/>
-        <w:t xml:space="preserve">        │ HTTP</w:t>
-        <w:br/>
-        <w:t xml:space="preserve">        ▼</w:t>
-        <w:br/>
-        <w:t xml:space="preserve">   ┌──────────────────┐   HTTP API   ┌─────────────────────┐</w:t>
-        <w:br/>
-        <w:t xml:space="preserve">   │  Streamlit UI    │ ──────────▶  │  FastAPI REST API    │</w:t>
-        <w:br/>
-        <w:t xml:space="preserve">   │  (port 8501)     │              │  (port 8000)         │</w:t>
-        <w:br/>
-        <w:t xml:space="preserve">   │                  │ ◀──────────  │                      │</w:t>
-        <w:br/>
-        <w:t xml:space="preserve">   │ • Single predict │   JSON       │ • POST /predict       │</w:t>
-        <w:br/>
-        <w:t xml:space="preserve">   │ • Batch CSV      │              │ • POST /predict/batch │</w:t>
-        <w:br/>
-        <w:t xml:space="preserve">   │ • Cluster view   │              │ • GET  /clusters      │</w:t>
-        <w:br/>
-        <w:t xml:space="preserve">   └──────────────────┘              │ • GET  /health        │</w:t>
-        <w:br/>
-        <w:t xml:space="preserve">                                     └──────────┬──────────┘</w:t>
-        <w:br/>
-        <w:t xml:space="preserve">                                                │</w:t>
-        <w:br/>
-        <w:t xml:space="preserve">                                                ▼</w:t>
-        <w:br/>
-        <w:t xml:space="preserve">                                     ┌─────────────────────┐</w:t>
-        <w:br/>
-        <w:t xml:space="preserve">                                     │  RFMPredictor        │</w:t>
-        <w:br/>
-        <w:t xml:space="preserve">                                     │  Transform Pipeline: │</w:t>
-        <w:br/>
-        <w:t xml:space="preserve">                                     │  Raw RFM             │</w:t>
-        <w:br/>
-        <w:t xml:space="preserve">                                     │     ↓                │</w:t>
-        <w:br/>
-        <w:t xml:space="preserve">                                     │  Winsorize           │</w:t>
-        <w:br/>
-        <w:t xml:space="preserve">                                     │     ↓                │</w:t>
-        <w:br/>
-        <w:t xml:space="preserve">                                     │  Log1p (F, M)        │</w:t>
-        <w:br/>
-        <w:t xml:space="preserve">                                     │     ↓                │</w:t>
-        <w:br/>
-        <w:t xml:space="preserve">                                     │  StandardScaler      │</w:t>
-        <w:br/>
-        <w:t xml:space="preserve">                                     │     ↓                │</w:t>
-        <w:br/>
-        <w:t xml:space="preserve">                                     │  KMeans.predict()    │</w:t>
-        <w:br/>
-        <w:t xml:space="preserve">                                     │     ↓                │</w:t>
-        <w:br/>
-        <w:t xml:space="preserve">                                     │  → Segment + Strategi│</w:t>
-        <w:br/>
-        <w:t xml:space="preserve">                                     └─────────────────────┘</w:t>
-        <w:br/>
+        <w:t>Gambar 5.0 — Arsitektur deployment: FastAPI (backend) + Streamlit (frontend) + RFMPredictor (transform pipeline) dengan model &amp; serving artifacts</w:t>
       </w:r>
     </w:p>
     <w:p>
@@ -3194,7 +3068,7 @@
         <w:drawing>
           <wp:inline xmlns:a="http://schemas.openxmlformats.org/drawingml/2006/main" xmlns:pic="http://schemas.openxmlformats.org/drawingml/2006/picture">
             <wp:extent cx="5400000" cy="3375000"/>
-            <wp:docPr id="10" name="Picture 10"/>
+            <wp:docPr id="12" name="Picture 12"/>
             <wp:cNvGraphicFramePr>
               <a:graphicFrameLocks noChangeAspect="1"/>
             </wp:cNvGraphicFramePr>
@@ -3203,125 +3077,6 @@
                 <pic:pic>
                   <pic:nvPicPr>
                     <pic:cNvPr id="0" name="01_streamlit_single_empty.png"/>
-                    <pic:cNvPicPr/>
-                  </pic:nvPicPr>
-                  <pic:blipFill>
-                    <a:blip r:embed="rId18"/>
-                    <a:stretch>
-                      <a:fillRect/>
-                    </a:stretch>
-                  </pic:blipFill>
-                  <pic:spPr>
-                    <a:xfrm>
-                      <a:off x="0" y="0"/>
-                      <a:ext cx="5400000" cy="3375000"/>
-                    </a:xfrm>
-                    <a:prstGeom prst="rect"/>
-                  </pic:spPr>
-                </pic:pic>
-              </a:graphicData>
-            </a:graphic>
-          </wp:inline>
-        </w:drawing>
-      </w:r>
-    </w:p>
-    <w:p>
-      <w:pPr>
-        <w:spacing w:after="240"/>
-        <w:jc w:val="center"/>
-      </w:pPr>
-      <w:r>
-        <w:rPr>
-          <w:i/>
-          <w:color w:val="555555"/>
-          <w:sz w:val="20"/>
-        </w:rPr>
-        <w:t>Gambar 5.1 — Form input Single Prediction (state awal)</w:t>
-      </w:r>
-    </w:p>
-    <w:p>
-      <w:pPr>
-        <w:jc w:val="center"/>
-      </w:pPr>
-      <w:r>
-        <w:drawing>
-          <wp:inline xmlns:a="http://schemas.openxmlformats.org/drawingml/2006/main" xmlns:pic="http://schemas.openxmlformats.org/drawingml/2006/picture">
-            <wp:extent cx="5400000" cy="3375000"/>
-            <wp:docPr id="11" name="Picture 11"/>
-            <wp:cNvGraphicFramePr>
-              <a:graphicFrameLocks noChangeAspect="1"/>
-            </wp:cNvGraphicFramePr>
-            <a:graphic>
-              <a:graphicData uri="http://schemas.openxmlformats.org/drawingml/2006/picture">
-                <pic:pic>
-                  <pic:nvPicPr>
-                    <pic:cNvPr id="0" name="02_streamlit_single_result.png"/>
-                    <pic:cNvPicPr/>
-                  </pic:nvPicPr>
-                  <pic:blipFill>
-                    <a:blip r:embed="rId19"/>
-                    <a:stretch>
-                      <a:fillRect/>
-                    </a:stretch>
-                  </pic:blipFill>
-                  <pic:spPr>
-                    <a:xfrm>
-                      <a:off x="0" y="0"/>
-                      <a:ext cx="5400000" cy="3375000"/>
-                    </a:xfrm>
-                    <a:prstGeom prst="rect"/>
-                  </pic:spPr>
-                </pic:pic>
-              </a:graphicData>
-            </a:graphic>
-          </wp:inline>
-        </w:drawing>
-      </w:r>
-    </w:p>
-    <w:p>
-      <w:pPr>
-        <w:spacing w:after="240"/>
-        <w:jc w:val="center"/>
-      </w:pPr>
-      <w:r>
-        <w:rPr>
-          <w:i/>
-          <w:color w:val="555555"/>
-          <w:sz w:val="20"/>
-        </w:rPr>
-        <w:t>Gambar 5.2 — Hasil prediksi: input R=30, F=2, M=350,5 diklasifikasikan sebagai segmen 'At Risk' beserta strategi</w:t>
-      </w:r>
-    </w:p>
-    <w:p>
-      <w:pPr>
-        <w:spacing w:after="120"/>
-      </w:pPr>
-      <w:r>
-        <w:rPr>
-          <w:b/>
-          <w:i w:val="0"/>
-          <w:sz w:val="22"/>
-        </w:rPr>
-        <w:t>Halaman 2 — Batch Prediction:</w:t>
-      </w:r>
-    </w:p>
-    <w:p>
-      <w:pPr>
-        <w:jc w:val="center"/>
-      </w:pPr>
-      <w:r>
-        <w:drawing>
-          <wp:inline xmlns:a="http://schemas.openxmlformats.org/drawingml/2006/main" xmlns:pic="http://schemas.openxmlformats.org/drawingml/2006/picture">
-            <wp:extent cx="5400000" cy="3375000"/>
-            <wp:docPr id="12" name="Picture 12"/>
-            <wp:cNvGraphicFramePr>
-              <a:graphicFrameLocks noChangeAspect="1"/>
-            </wp:cNvGraphicFramePr>
-            <a:graphic>
-              <a:graphicData uri="http://schemas.openxmlformats.org/drawingml/2006/picture">
-                <pic:pic>
-                  <pic:nvPicPr>
-                    <pic:cNvPr id="0" name="03_streamlit_batch.png"/>
                     <pic:cNvPicPr/>
                   </pic:nvPicPr>
                   <pic:blipFill>
@@ -3355,7 +3110,7 @@
           <w:color w:val="555555"/>
           <w:sz w:val="20"/>
         </w:rPr>
-        <w:t>Gambar 5.3 — Form upload CSV untuk batch prediction</w:t>
+        <w:t>Gambar 5.1 — Form input Single Prediction (state awal)</w:t>
       </w:r>
     </w:p>
     <w:p>
@@ -3374,7 +3129,7 @@
               <a:graphicData uri="http://schemas.openxmlformats.org/drawingml/2006/picture">
                 <pic:pic>
                   <pic:nvPicPr>
-                    <pic:cNvPr id="0" name="04_streamlit_batch_result.png"/>
+                    <pic:cNvPr id="0" name="02_streamlit_single_result.png"/>
                     <pic:cNvPicPr/>
                   </pic:nvPicPr>
                   <pic:blipFill>
@@ -3408,7 +3163,7 @@
           <w:color w:val="555555"/>
           <w:sz w:val="20"/>
         </w:rPr>
-        <w:t>Gambar 5.4 — Hasil batch: 5 pelanggan diklasifikasikan, tabel + bar chart distribusi segmen + opsi download CSV</w:t>
+        <w:t>Gambar 5.2 — Hasil prediksi: input R=30, F=2, M=350,5 diklasifikasikan sebagai segmen 'At Risk' beserta strategi</w:t>
       </w:r>
     </w:p>
     <w:p>
@@ -3421,7 +3176,7 @@
           <w:i w:val="0"/>
           <w:sz w:val="22"/>
         </w:rPr>
-        <w:t>Halaman 3 — Cluster Overview:</w:t>
+        <w:t>Halaman 2 — Batch Prediction:</w:t>
       </w:r>
     </w:p>
     <w:p>
@@ -3440,7 +3195,7 @@
               <a:graphicData uri="http://schemas.openxmlformats.org/drawingml/2006/picture">
                 <pic:pic>
                   <pic:nvPicPr>
-                    <pic:cNvPr id="0" name="05_streamlit_cluster_overview.png"/>
+                    <pic:cNvPr id="0" name="03_streamlit_batch.png"/>
                     <pic:cNvPicPr/>
                   </pic:nvPicPr>
                   <pic:blipFill>
@@ -3474,6 +3229,125 @@
           <w:color w:val="555555"/>
           <w:sz w:val="20"/>
         </w:rPr>
+        <w:t>Gambar 5.3 — Form upload CSV untuk batch prediction</w:t>
+      </w:r>
+    </w:p>
+    <w:p>
+      <w:pPr>
+        <w:jc w:val="center"/>
+      </w:pPr>
+      <w:r>
+        <w:drawing>
+          <wp:inline xmlns:a="http://schemas.openxmlformats.org/drawingml/2006/main" xmlns:pic="http://schemas.openxmlformats.org/drawingml/2006/picture">
+            <wp:extent cx="5400000" cy="3375000"/>
+            <wp:docPr id="15" name="Picture 15"/>
+            <wp:cNvGraphicFramePr>
+              <a:graphicFrameLocks noChangeAspect="1"/>
+            </wp:cNvGraphicFramePr>
+            <a:graphic>
+              <a:graphicData uri="http://schemas.openxmlformats.org/drawingml/2006/picture">
+                <pic:pic>
+                  <pic:nvPicPr>
+                    <pic:cNvPr id="0" name="04_streamlit_batch_result.png"/>
+                    <pic:cNvPicPr/>
+                  </pic:nvPicPr>
+                  <pic:blipFill>
+                    <a:blip r:embed="rId23"/>
+                    <a:stretch>
+                      <a:fillRect/>
+                    </a:stretch>
+                  </pic:blipFill>
+                  <pic:spPr>
+                    <a:xfrm>
+                      <a:off x="0" y="0"/>
+                      <a:ext cx="5400000" cy="3375000"/>
+                    </a:xfrm>
+                    <a:prstGeom prst="rect"/>
+                  </pic:spPr>
+                </pic:pic>
+              </a:graphicData>
+            </a:graphic>
+          </wp:inline>
+        </w:drawing>
+      </w:r>
+    </w:p>
+    <w:p>
+      <w:pPr>
+        <w:spacing w:after="240"/>
+        <w:jc w:val="center"/>
+      </w:pPr>
+      <w:r>
+        <w:rPr>
+          <w:i/>
+          <w:color w:val="555555"/>
+          <w:sz w:val="20"/>
+        </w:rPr>
+        <w:t>Gambar 5.4 — Hasil batch: 5 pelanggan diklasifikasikan, tabel + bar chart distribusi segmen + opsi download CSV</w:t>
+      </w:r>
+    </w:p>
+    <w:p>
+      <w:pPr>
+        <w:spacing w:after="120"/>
+      </w:pPr>
+      <w:r>
+        <w:rPr>
+          <w:b/>
+          <w:i w:val="0"/>
+          <w:sz w:val="22"/>
+        </w:rPr>
+        <w:t>Halaman 3 — Cluster Overview:</w:t>
+      </w:r>
+    </w:p>
+    <w:p>
+      <w:pPr>
+        <w:jc w:val="center"/>
+      </w:pPr>
+      <w:r>
+        <w:drawing>
+          <wp:inline xmlns:a="http://schemas.openxmlformats.org/drawingml/2006/main" xmlns:pic="http://schemas.openxmlformats.org/drawingml/2006/picture">
+            <wp:extent cx="5400000" cy="3375000"/>
+            <wp:docPr id="16" name="Picture 16"/>
+            <wp:cNvGraphicFramePr>
+              <a:graphicFrameLocks noChangeAspect="1"/>
+            </wp:cNvGraphicFramePr>
+            <a:graphic>
+              <a:graphicData uri="http://schemas.openxmlformats.org/drawingml/2006/picture">
+                <pic:pic>
+                  <pic:nvPicPr>
+                    <pic:cNvPr id="0" name="05_streamlit_cluster_overview.png"/>
+                    <pic:cNvPicPr/>
+                  </pic:nvPicPr>
+                  <pic:blipFill>
+                    <a:blip r:embed="rId24"/>
+                    <a:stretch>
+                      <a:fillRect/>
+                    </a:stretch>
+                  </pic:blipFill>
+                  <pic:spPr>
+                    <a:xfrm>
+                      <a:off x="0" y="0"/>
+                      <a:ext cx="5400000" cy="3375000"/>
+                    </a:xfrm>
+                    <a:prstGeom prst="rect"/>
+                  </pic:spPr>
+                </pic:pic>
+              </a:graphicData>
+            </a:graphic>
+          </wp:inline>
+        </w:drawing>
+      </w:r>
+    </w:p>
+    <w:p>
+      <w:pPr>
+        <w:spacing w:after="240"/>
+        <w:jc w:val="center"/>
+      </w:pPr>
+      <w:r>
+        <w:rPr>
+          <w:i/>
+          <w:color w:val="555555"/>
+          <w:sz w:val="20"/>
+        </w:rPr>
         <w:t>Gambar 5.5 — Profil 4 cluster + visualisasi jumlah pelanggan &amp; total monetary per cluster</w:t>
       </w:r>
     </w:p>
@@ -3498,7 +3372,7 @@
         <w:drawing>
           <wp:inline xmlns:a="http://schemas.openxmlformats.org/drawingml/2006/main" xmlns:pic="http://schemas.openxmlformats.org/drawingml/2006/picture">
             <wp:extent cx="5400000" cy="4556250"/>
-            <wp:docPr id="15" name="Picture 15"/>
+            <wp:docPr id="17" name="Picture 17"/>
             <wp:cNvGraphicFramePr>
               <a:graphicFrameLocks noChangeAspect="1"/>
             </wp:cNvGraphicFramePr>
@@ -3510,7 +3384,7 @@
                     <pic:cNvPicPr/>
                   </pic:nvPicPr>
                   <pic:blipFill>
-                    <a:blip r:embed="rId23"/>
+                    <a:blip r:embed="rId25"/>
                     <a:stretch>
                       <a:fillRect/>
                     </a:stretch>
@@ -3814,81 +3688,55 @@
     </w:p>
     <w:p>
       <w:pPr>
-        <w:spacing w:after="120"/>
-        <w:ind w:left="283"/>
-        <w:shd w:fill="F2F2F2"/>
+        <w:jc w:val="center"/>
+      </w:pPr>
+      <w:r>
+        <w:drawing>
+          <wp:inline xmlns:a="http://schemas.openxmlformats.org/drawingml/2006/main" xmlns:pic="http://schemas.openxmlformats.org/drawingml/2006/picture">
+            <wp:extent cx="5040000" cy="5040000"/>
+            <wp:docPr id="18" name="Picture 18"/>
+            <wp:cNvGraphicFramePr>
+              <a:graphicFrameLocks noChangeAspect="1"/>
+            </wp:cNvGraphicFramePr>
+            <a:graphic>
+              <a:graphicData uri="http://schemas.openxmlformats.org/drawingml/2006/picture">
+                <pic:pic>
+                  <pic:nvPicPr>
+                    <pic:cNvPr id="0" name="03_deployment_layers.png"/>
+                    <pic:cNvPicPr/>
+                  </pic:nvPicPr>
+                  <pic:blipFill>
+                    <a:blip r:embed="rId26"/>
+                    <a:stretch>
+                      <a:fillRect/>
+                    </a:stretch>
+                  </pic:blipFill>
+                  <pic:spPr>
+                    <a:xfrm>
+                      <a:off x="0" y="0"/>
+                      <a:ext cx="5040000" cy="5040000"/>
+                    </a:xfrm>
+                    <a:prstGeom prst="rect"/>
+                  </pic:spPr>
+                </pic:pic>
+              </a:graphicData>
+            </a:graphic>
+          </wp:inline>
+        </w:drawing>
+      </w:r>
+    </w:p>
+    <w:p>
+      <w:pPr>
+        <w:spacing w:after="240"/>
+        <w:jc w:val="center"/>
       </w:pPr>
       <w:r>
         <w:rPr>
-          <w:rFonts w:ascii="Consolas" w:hAnsi="Consolas"/>
-          <w:sz w:val="18"/>
-          <w:rFonts w:ascii="Consolas" w:hAnsi="Consolas" w:cs="Consolas"/>
+          <w:i/>
+          <w:color w:val="555555"/>
+          <w:sz w:val="20"/>
         </w:rPr>
-        <w:t>┌─────────────────────────────────────────────────────────────┐</w:t>
-        <w:br/>
-        <w:t>│            STRATEGI DEPLOYMENT MULTI-LAYER                  │</w:t>
-        <w:br/>
-        <w:t>└─────────────────────────────────────────────────────────────┘</w:t>
-        <w:br/>
-        <w:br/>
-        <w:t xml:space="preserve">  Layer 1: LOKAL DEVELOPMENT</w:t>
-        <w:br/>
-        <w:t xml:space="preserve">  ┌───────────────────────────────────────────┐</w:t>
-        <w:br/>
-        <w:t xml:space="preserve">  │  ./scripts/run_app.sh                     │</w:t>
-        <w:br/>
-        <w:t xml:space="preserve">  │  - FastAPI di localhost:8000              │</w:t>
-        <w:br/>
-        <w:t xml:space="preserve">  │  - Streamlit di localhost:8501            │</w:t>
-        <w:br/>
-        <w:t xml:space="preserve">  │  - Untuk pengembangan &amp; testing internal  │</w:t>
-        <w:br/>
-        <w:t xml:space="preserve">  └───────────────────────────────────────────┘</w:t>
-        <w:br/>
-        <w:t xml:space="preserve">                      │</w:t>
-        <w:br/>
-        <w:t xml:space="preserve">                      ▼  (saat butuh demo publik)</w:t>
-        <w:br/>
-        <w:t xml:space="preserve">  Layer 2: DEMO PUBLIK (Cloudflare Tunnel)</w:t>
-        <w:br/>
-        <w:t xml:space="preserve">  ┌───────────────────────────────────────────┐</w:t>
-        <w:br/>
-        <w:t xml:space="preserve">  │  ./scripts/run_demo.sh                    │</w:t>
-        <w:br/>
-        <w:t xml:space="preserve">  │  - Layer 1 + tunnel publik via            │</w:t>
-        <w:br/>
-        <w:t xml:space="preserve">  │    cloudflared                            │</w:t>
-        <w:br/>
-        <w:t xml:space="preserve">  │  - URL: https://xxx.trycloudflare.com     │</w:t>
-        <w:br/>
-        <w:t xml:space="preserve">  │  - Cocok untuk demo sidang / presentasi   │</w:t>
-        <w:br/>
-        <w:t xml:space="preserve">  │  - Tidak butuh signup / kartu kredit      │</w:t>
-        <w:br/>
-        <w:t xml:space="preserve">  │  - Komputer harus tetap menyala           │</w:t>
-        <w:br/>
-        <w:t xml:space="preserve">  └───────────────────────────────────────────┘</w:t>
-        <w:br/>
-        <w:t xml:space="preserve">                      │</w:t>
-        <w:br/>
-        <w:t xml:space="preserve">                      ▼  (saat butuh hosting permanen)</w:t>
-        <w:br/>
-        <w:t xml:space="preserve">  Layer 3: HOSTING PERMANEN (Hugging Face Spaces)</w:t>
-        <w:br/>
-        <w:t xml:space="preserve">  ┌───────────────────────────────────────────┐</w:t>
-        <w:br/>
-        <w:t xml:space="preserve">  │  Dockerfile + ./scripts/deploy_hf.sh      │</w:t>
-        <w:br/>
-        <w:t xml:space="preserve">  │  - Container Docker (FastAPI + Streamlit) │</w:t>
-        <w:br/>
-        <w:t xml:space="preserve">  │  - Di-host di Hugging Face Spaces gratis  │</w:t>
-        <w:br/>
-        <w:t xml:space="preserve">  │  - URL stabil 24/7                        │</w:t>
-        <w:br/>
-        <w:t xml:space="preserve">  │  - Auto-rebuild saat code di-push         │</w:t>
-        <w:br/>
-        <w:t xml:space="preserve">  └───────────────────────────────────────────┘</w:t>
-        <w:br/>
+        <w:t>Gambar 5.7 — Strategi deployment multi-layer: lokal (development) → Cloudflare Tunnel (demo publik) → Docker + Hugging Face Spaces (hosting permanen)</w:t>
       </w:r>
     </w:p>
     <w:p>

</xml_diff>